<commit_message>
feat: add focused error practice and verify customer test cases
</commit_message>
<xml_diff>
--- a/docs/VSM_TZ_v4_1.docx
+++ b/docs/VSM_TZ_v4_1.docx
@@ -316,6 +316,34 @@
     <w:p>
       <w:r>
         <w:t>Сдаваемые материалы: исходный код, инструкция запуска, архитектура, API, пользовательский путь, сценарии, описание ограничений и использования ИИ при разработке. Применение ИИ при написании кода не подменяет проверку и понимание правил командой.</w:t>
+      </w:r>
+    </w:p>
+    <w:p>
+      <w:pPr>
+        <w:pStyle w:val="Heading1"/>
+      </w:pPr>
+      <w:r>
+        <w:t>Дополнение. Отработка ошибок</w:t>
+      </w:r>
+    </w:p>
+    <w:p>
+      <w:r>
+        <w:t>По невыполненным пунктам завершённой смены предлагаются короткие упражнения: «Что сделать в первую очередь», «Помочь без лишних обещаний», «Чья это вещь?». Каждое содержит два или три решения в изменённых обстоятельствах. Основание рекомендации раскрывается пользователю. ИИ для подбора не применяется.</w:t>
+      </w:r>
+    </w:p>
+    <w:p>
+      <w:r>
+        <w:t>Упражнение сохраняет ссылку на исходную смену и собственную версию условий. Доступны пауза, продолжение после обновления страницы и повтор. На профиль остаётся одно незавершённое прохождение. Зачёт упражнения требует выполнения всех его пунктов, разрешения обращения, отсутствия критической ошибки и безопасности не ниже 80.</w:t>
+      </w:r>
+    </w:p>
+    <w:p>
+      <w:r>
+        <w:t>Итог сравнивает невыполненные пункты исходной смены с решениями в упражнении и предлагает самостоятельную проверку полной смены. Упражнения не изменяют старые оценки, компетенции, рейтинг, достижения и испытание; их история отображается отдельно. Это не подтверждение освоения навыка. Существующий экспорт полных смен не включает упражнения.</w:t>
+      </w:r>
+    </w:p>
+    <w:p>
+      <w:r>
+        <w:t>Прогресс показывает пять наиболее часто невыполненных пунктов с количеством наблюдений, отдельно по сценарию, версии и режиму; доступен переход в упражнение либо исходный разбор. Подробные правила, устройство и проверки дополнения описаны в docs/practice.md.</w:t>
       </w:r>
     </w:p>
     <w:sectPr>

</xml_diff>

<commit_message>
docs: document scenario authoring, verification and updated submission
</commit_message>
<xml_diff>
--- a/docs/VSM_TZ_v4_1.docx
+++ b/docs/VSM_TZ_v4_1.docx
@@ -346,6 +346,42 @@
         <w:t>Прогресс показывает пять наиболее часто невыполненных пунктов с количеством наблюдений, отдельно по сценарию, версии и режиму; доступен переход в упражнение либо исходный разбор. Подробные правила, устройство и проверки дополнения описаны в docs/practice.md.</w:t>
       </w:r>
     </w:p>
+    <w:p>
+      <w:pPr>
+        <w:pStyle w:val="Heading1"/>
+      </w:pPr>
+      <w:r>
+        <w:t>Дополнение. Редактор методиста</w:t>
+      </w:r>
+    </w:p>
+    <w:p>
+      <w:r>
+        <w:t>В браузере доступен раздел «Редактор». Вход по отдельному коду действует восемь часов. Автор копирует опубликованную версию, меняет реплики, шаги, действия, переходы, условия, последствия, срок и источники. Черновик хранится в базе и принадлежит профилю автора. Ошибки содержания допускаются при сохранении, но запрещают пробное прохождение и публикацию. При конфликте между вкладками сервер сохраняет первую принятую редакцию, а вторая остаётся в форме для переноса правок.</w:t>
+      </w:r>
+    </w:p>
+    <w:p>
+      <w:r>
+        <w:t>Проверка выявляет неизвестные переходы, недостижимые шаги и состояния без пути к завершению. Проба использует общий игровой движок и отдельное хранилище: она не меняет результаты сотрудников, награды или рейтинги. Публикация создаёт новую неизменяемую версию для обучения. Проверки используют закреплённую версию 1; начатые прохождения продолжаются на своей версии. Повтор публикации не создаёт вторую копию.</w:t>
+      </w:r>
+    </w:p>
+    <w:p>
+      <w:r>
+        <w:t>Редактор поддерживает два существующих вида смен. Критерии оценки, алгоритм просрочки, задержка появления багажа и формула зачёта сохраняются. Изменение типов событий и коротких упражнений остаётся задачей разработки. Проверка структуры не подтверждает предметную правильность: автор обязан проверить содержание и учебные исходы. Подробный контракт и ограничения приведены в editor.md.</w:t>
+      </w:r>
+    </w:p>
+    <w:p>
+      <w:pPr>
+        <w:pStyle w:val="Heading1"/>
+      </w:pPr>
+      <w:r>
+        <w:t>Дополнение. Восстановление связи</w:t>
+      </w:r>
+    </w:p>
+    <w:p>
+      <w:r>
+        <w:t>Фоновые запросы выполняются последовательно и приостанавливаются в скрытой вкладке. Возвращение на вкладку или восстановление сети запускает обновление. Успешный запрос снимает сообщение о потере связи. Время игрового обращения остаётся серверным: отсутствие сети не продлевает срок. Ошибки действий и ошибки фонового обновления показываются отдельно. После обновления CSRF-токена отклонённый по CSRF запрос повторяется один раз с тем же содержимым; при сетевой неопределённости изменяющие запросы автоматически не повторяются.</w:t>
+      </w:r>
+    </w:p>
     <w:sectPr>
       <w:pgSz w:w="12240" w:h="15840"/>
       <w:pgMar w:top="1080" w:right="1224" w:bottom="1080" w:left="1224" w:header="720" w:footer="720" w:gutter="0"/>

</xml_diff>

<commit_message>
fix: clarify competency history and complete achievement cards
</commit_message>
<xml_diff>
--- a/docs/VSM_TZ_v4_1.docx
+++ b/docs/VSM_TZ_v4_1.docx
@@ -20,7 +20,7 @@
     </w:p>
     <w:p>
       <w:r>
-        <w:t>25 сентября 2026 года. Команда «НаракаТОПчик».</w:t>
+        <w:t>26 сентября 2026 года. Уточнено после проверки командой. Команда «НаракаТОПчик».</w:t>
       </w:r>
     </w:p>
     <w:p>
@@ -244,12 +244,12 @@
     </w:p>
     <w:p>
       <w:r>
-        <w:t>Анализ навыков учитывает до пяти завершённых попыток каждого сценария, отдельно по режиму и версии. Показываются число наблюдений и выполненные критерии. При критическом нарушении безопасности вместо положительного процента выводится «Критическая ошибка». При отсутствии попыток выводится «Пока недостаточно данных». Результат не называется профессиональной аттестацией.</w:t>
+        <w:t>Основная оценка навыка относится к последней завершённой попытке каждого сценария, режима и версии. Рядом видны дата, число выполненных пунктов и ссылка на разбор. Критическая ошибка относится к той попытке, в которой допущена: следующая успешная попытка показывает свой результат. В раскрываемой истории остаются до пяти попыток, число выполненных пунктов и число попыток с критическими ошибками. Общий положительный процент не показывается, если в этой выборке есть критическая ошибка. При отсутствии попыток выводится «Пока недостаточно данных». Результат не называется профессиональной аттестацией.</w:t>
       </w:r>
     </w:p>
     <w:p>
       <w:r>
-        <w:t>Уведомления создаются по трём причинам: публикация доступного сценария, доступное испытание, приближение окончания временных очков. Уведомление можно прочитать и открыть связанный раздел. Один повод не создаёт повторные сообщения. Предупреждение о бонусе появляется в последний час его действия. Для показа есть локальная команда с бонусом на 90 секунд и предупреждением за 60 секунд; такой бонус помечен демонстрационным.</w:t>
+        <w:t>Уведомления создаются по трём причинам: публикация доступного сценария, доступное испытание, приближение окончания временных очков. Уведомление можно прочитать и открыть связанный раздел. Один повод не создаёт повторные сообщения. Предупреждение о бонусе появляется в последний час его действия. Для показа в локальном разделе «Прогресс» есть «Ускоренная демонстрация временных баллов»: 20 баллов на 90 секунд, предупреждение за 60 секунд до истечения. Доступна один раз на профиль, повторное нажатие не продлевает срок. Сохранена и команда demo:bonus-expiry. Публичный сервер отклоняет выдачу демонстрационных баллов.</w:t>
       </w:r>
     </w:p>
     <w:p>
@@ -380,6 +380,39 @@
     <w:p>
       <w:r>
         <w:t>Фоновые запросы выполняются последовательно и приостанавливаются в скрытой вкладке. Возвращение на вкладку или восстановление сети запускает обновление. Успешный запрос снимает сообщение о потере связи. Время игрового обращения остаётся серверным: отсутствие сети не продлевает срок. Ошибки действий и ошибки фонового обновления показываются отдельно. После обновления CSRF-токена отклонённый по CSRF запрос повторяется один раз с тем же содержимым; при сетевой неопределённости изменяющие запросы автоматически не повторяются.</w:t>
+      </w:r>
+    </w:p>
+    <w:p>
+      <w:pPr>
+        <w:pStyle w:val="Heading1"/>
+      </w:pPr>
+      <w:r>
+        <w:t>Уточнения после проверки 26 сентября</w:t>
+      </w:r>
+    </w:p>
+    <w:p>
+      <w:r>
+        <w:t>Названия навыков в интерфейсе: «Общение с пассажиром», «Порядок действий», «Безопасность и приоритеты». В сохранённых данных остаются прежние ключи: это сохраняет совместимость со старыми попытками и версиями сценариев.</w:t>
+      </w:r>
+    </w:p>
+    <w:p>
+      <w:r>
+        <w:t>Четыре достижения: «Первая смена», «Верный приоритет», «Внимание к обстоятельствам», «Две ситуации — два решения». Карточки видны в профиле и прогрессе, включая ещё не полученные. Каждая содержит значок, название и условие. Полученная награда содержит дату и ссылку на попытку-основание. В старых записях ссылка не сохранялась: такие карточки прямо сообщают об этом, дата награды остаётся прежней. Идентификаторы наград не меняются, повторные награды не создаются.</w:t>
+      </w:r>
+    </w:p>
+    <w:p>
+      <w:r>
+        <w:t>Испытание называется «Две ситуации — два решения». До вступления объясняются обе длительности: 24 часа на две успешные проверки и затем 24 часа действия награды. Максимум за два сценария — 200 основных баллов, с наградой испытания — 220 в рейтинге. Временная награда не меняет уровень и оценки попыток.</w:t>
+      </w:r>
+    </w:p>
+    <w:p>
+      <w:r>
+        <w:t>После предупреждения пассажиров и сообщения ответственным во втором сценарии появляется «Обязательные действия выполнены» и пояснение перехода к разбору. Кнопка «Завершить обращение и открыть разбор» фиксирует окончание. Это уточнение версии 4.1: автоматического завершения после второго решения нет. Условия и баллы опубликованной версии 1 сохраняются.</w:t>
+      </w:r>
+    </w:p>
+    <w:p>
+      <w:r>
+        <w:t>Профиль создаётся автоматически при первом входе. Отдельной регистрации и восстановления доступа в первой версии нет. Псевдоним — от 2 до 40 знаков, может совпадать с чужим. Уникален номер профиля. Смена портрета влияет только на оформление. Бригада и депо в демонстрации не редактируются. После обновления страницы сохраняется открытый раздел; незавершённую смену можно продолжить из списка сценариев.</w:t>
       </w:r>
     </w:p>
     <w:sectPr>
@@ -1105,9 +1138,6 @@
     <w:qFormat/>
     <w:rsid w:val="00FC693F"/>
     <w:pPr>
-      <w:pBdr>
-        <w:bottom w:val="single" w:sz="8" w:space="4" w:color="4F81BD" w:themeColor="accent1"/>
-      </w:pBdr>
       <w:spacing w:after="300" w:line="240" w:lineRule="auto"/>
       <w:contextualSpacing/>
     </w:pPr>
@@ -1592,9 +1622,6 @@
     <w:qFormat/>
     <w:rsid w:val="00FC693F"/>
     <w:pPr>
-      <w:pBdr>
-        <w:bottom w:val="single" w:sz="4" w:space="4" w:color="4F81BD" w:themeColor="accent1"/>
-      </w:pBdr>
       <w:spacing w:before="200" w:after="280"/>
       <w:ind w:left="936" w:right="936"/>
     </w:pPr>

</xml_diff>